<commit_message>
data: 2026.05.19-1851-JST — Auto-timestamped data_version + sidecar + auto-restart
</commit_message>
<xml_diff>
--- a/UPDATE_PIPELINE.docx
+++ b/UPDATE_PIPELINE.docx
@@ -2,7 +2,7 @@
 <file path=word/document.xml><?xml version="1.0" encoding="utf-8"?>
 <w:document xmlns:w="http://schemas.openxmlformats.org/wordprocessingml/2006/main" xmlns:m="http://schemas.openxmlformats.org/officeDocument/2006/math" xmlns:r="http://schemas.openxmlformats.org/officeDocument/2006/relationships" xmlns:o="urn:schemas-microsoft-com:office:office" xmlns:v="urn:schemas-microsoft-com:vml" xmlns:w10="urn:schemas-microsoft-com:office:word" xmlns:a="http://schemas.openxmlformats.org/drawingml/2006/main" xmlns:pic="http://schemas.openxmlformats.org/drawingml/2006/picture" xmlns:wp="http://schemas.openxmlformats.org/drawingml/2006/wordprocessingDrawing">
   <w:body>
-    <w:bookmarkStart w:id="46" w:name="Xc309bbba672b3847141d59aeeef98534c9c9762"/>
+    <w:bookmarkStart w:id="47" w:name="Xc309bbba672b3847141d59aeeef98534c9c9762"/>
     <w:p>
       <w:pPr>
         <w:pStyle w:val="Heading1"/>
@@ -302,6 +302,99 @@
     <w:p>
       <w:pPr>
         <w:pStyle w:val="FirstParagraph"/>
+      </w:pPr>
+      <w:r>
+        <w:t xml:space="preserve">The</w:t>
+      </w:r>
+      <w:r>
+        <w:t xml:space="preserve"> </w:t>
+      </w:r>
+      <w:r>
+        <w:rPr>
+          <w:rStyle w:val="VerbatimChar"/>
+        </w:rPr>
+        <w:t xml:space="preserve">data_version</w:t>
+      </w:r>
+      <w:r>
+        <w:t xml:space="preserve"> </w:t>
+      </w:r>
+      <w:r>
+        <w:t xml:space="preserve">is</w:t>
+      </w:r>
+      <w:r>
+        <w:t xml:space="preserve"> </w:t>
+      </w:r>
+      <w:r>
+        <w:rPr>
+          <w:bCs/>
+          <w:b/>
+        </w:rPr>
+        <w:t xml:space="preserve">auto-generated from the current Japan-Standard time</w:t>
+      </w:r>
+      <w:r>
+        <w:t xml:space="preserve"> </w:t>
+      </w:r>
+      <w:r>
+        <w:t xml:space="preserve">(</w:t>
+      </w:r>
+      <w:r>
+        <w:rPr>
+          <w:rStyle w:val="VerbatimChar"/>
+        </w:rPr>
+        <w:t xml:space="preserve">YYYY.MM.DD-HHMM-JST</w:t>
+      </w:r>
+      <w:r>
+        <w:t xml:space="preserve">, e.g. </w:t>
+      </w:r>
+      <w:r>
+        <w:rPr>
+          <w:rStyle w:val="VerbatimChar"/>
+        </w:rPr>
+        <w:t xml:space="preserve">2026.05.19-1850-JST</w:t>
+      </w:r>
+      <w:r>
+        <w:t xml:space="preserve">) so every push gets a</w:t>
+      </w:r>
+      <w:r>
+        <w:t xml:space="preserve"> </w:t>
+      </w:r>
+      <w:r>
+        <w:t xml:space="preserve">unique stamp even within the same day. Override with</w:t>
+      </w:r>
+      <w:r>
+        <w:t xml:space="preserve"> </w:t>
+      </w:r>
+      <w:r>
+        <w:rPr>
+          <w:rStyle w:val="VerbatimChar"/>
+        </w:rPr>
+        <w:t xml:space="preserve">--data-version "&lt;your-string&gt;"</w:t>
+      </w:r>
+      <w:r>
+        <w:t xml:space="preserve"> </w:t>
+      </w:r>
+      <w:r>
+        <w:t xml:space="preserve">if you want a custom label</w:t>
+      </w:r>
+      <w:r>
+        <w:t xml:space="preserve"> </w:t>
+      </w:r>
+      <w:r>
+        <w:t xml:space="preserve">(e.g. </w:t>
+      </w:r>
+      <w:r>
+        <w:rPr>
+          <w:rStyle w:val="VerbatimChar"/>
+        </w:rPr>
+        <w:t xml:space="preserve">2026.05.20-gsfc-release</w:t>
+      </w:r>
+      <w:r>
+        <w:t xml:space="preserve">).</w:t>
+      </w:r>
+    </w:p>
+    <w:p>
+      <w:pPr>
+        <w:pStyle w:val="BodyText"/>
       </w:pPr>
       <w:r>
         <w:t xml:space="preserve">That single command:</w:t>
@@ -1457,7 +1550,7 @@
     </w:p>
     <w:bookmarkEnd w:id="23"/>
     <w:bookmarkEnd w:id="24"/>
-    <w:bookmarkStart w:id="26" w:name="version.json-schema-on-github"/>
+    <w:bookmarkStart w:id="27" w:name="version.json-schema-on-github"/>
     <w:p>
       <w:pPr>
         <w:pStyle w:val="Heading2"/>
@@ -1579,13 +1672,13 @@
         <w:rPr>
           <w:rStyle w:val="NormalTok"/>
         </w:rPr>
-        <w:t xml:space="preserve"> </w:t>
+        <w:t xml:space="preserve">         </w:t>
       </w:r>
       <w:r>
         <w:rPr>
           <w:rStyle w:val="StringTok"/>
         </w:rPr>
-        <w:t xml:space="preserve">"2026.05.19N-preview"</w:t>
+        <w:t xml:space="preserve">"2026.05.19-1850-JST"</w:t>
       </w:r>
       <w:r>
         <w:rPr>
@@ -1618,13 +1711,130 @@
         <w:rPr>
           <w:rStyle w:val="NormalTok"/>
         </w:rPr>
-        <w:t xml:space="preserve"> </w:t>
+        <w:t xml:space="preserve">         </w:t>
       </w:r>
       <w:r>
         <w:rPr>
           <w:rStyle w:val="StringTok"/>
         </w:rPr>
         <w:t xml:space="preserve">"2026-05-19"</w:t>
+      </w:r>
+      <w:r>
+        <w:rPr>
+          <w:rStyle w:val="FunctionTok"/>
+        </w:rPr>
+        <w:t xml:space="preserve">,</w:t>
+      </w:r>
+      <w:r>
+        <w:br/>
+      </w:r>
+      <w:r>
+        <w:rPr>
+          <w:rStyle w:val="NormalTok"/>
+        </w:rPr>
+        <w:t xml:space="preserve">  </w:t>
+      </w:r>
+      <w:r>
+        <w:rPr>
+          <w:rStyle w:val="DataTypeTok"/>
+        </w:rPr>
+        <w:t xml:space="preserve">"release_time_jst"</w:t>
+      </w:r>
+      <w:r>
+        <w:rPr>
+          <w:rStyle w:val="FunctionTok"/>
+        </w:rPr>
+        <w:t xml:space="preserve">:</w:t>
+      </w:r>
+      <w:r>
+        <w:rPr>
+          <w:rStyle w:val="NormalTok"/>
+        </w:rPr>
+        <w:t xml:space="preserve">     </w:t>
+      </w:r>
+      <w:r>
+        <w:rPr>
+          <w:rStyle w:val="StringTok"/>
+        </w:rPr>
+        <w:t xml:space="preserve">"18:50:21"</w:t>
+      </w:r>
+      <w:r>
+        <w:rPr>
+          <w:rStyle w:val="FunctionTok"/>
+        </w:rPr>
+        <w:t xml:space="preserve">,</w:t>
+      </w:r>
+      <w:r>
+        <w:br/>
+      </w:r>
+      <w:r>
+        <w:rPr>
+          <w:rStyle w:val="NormalTok"/>
+        </w:rPr>
+        <w:t xml:space="preserve">  </w:t>
+      </w:r>
+      <w:r>
+        <w:rPr>
+          <w:rStyle w:val="DataTypeTok"/>
+        </w:rPr>
+        <w:t xml:space="preserve">"release_datetime_jst"</w:t>
+      </w:r>
+      <w:r>
+        <w:rPr>
+          <w:rStyle w:val="FunctionTok"/>
+        </w:rPr>
+        <w:t xml:space="preserve">:</w:t>
+      </w:r>
+      <w:r>
+        <w:rPr>
+          <w:rStyle w:val="NormalTok"/>
+        </w:rPr>
+        <w:t xml:space="preserve"> </w:t>
+      </w:r>
+      <w:r>
+        <w:rPr>
+          <w:rStyle w:val="StringTok"/>
+        </w:rPr>
+        <w:t xml:space="preserve">"2026-05-19 18:50:21+09:00"</w:t>
+      </w:r>
+      <w:r>
+        <w:rPr>
+          <w:rStyle w:val="FunctionTok"/>
+        </w:rPr>
+        <w:t xml:space="preserve">,</w:t>
+      </w:r>
+      <w:r>
+        <w:br/>
+      </w:r>
+      <w:r>
+        <w:rPr>
+          <w:rStyle w:val="NormalTok"/>
+        </w:rPr>
+        <w:t xml:space="preserve">  </w:t>
+      </w:r>
+      <w:r>
+        <w:rPr>
+          <w:rStyle w:val="DataTypeTok"/>
+        </w:rPr>
+        <w:t xml:space="preserve">"release_datetime_utc"</w:t>
+      </w:r>
+      <w:r>
+        <w:rPr>
+          <w:rStyle w:val="FunctionTok"/>
+        </w:rPr>
+        <w:t xml:space="preserve">:</w:t>
+      </w:r>
+      <w:r>
+        <w:rPr>
+          <w:rStyle w:val="NormalTok"/>
+        </w:rPr>
+        <w:t xml:space="preserve"> </w:t>
+      </w:r>
+      <w:r>
+        <w:rPr>
+          <w:rStyle w:val="StringTok"/>
+        </w:rPr>
+        <w:t xml:space="preserve">"2026-05-19 09:50:21Z"</w:t>
       </w:r>
       <w:r>
         <w:rPr>
@@ -1887,7 +2097,22 @@
               <w:jc w:val="left"/>
             </w:pPr>
             <w:r>
-              <w:t xml:space="preserve">The string compared client-side.</w:t>
+              <w:t xml:space="preserve">The string compared client-side. Auto-generated as</w:t>
+            </w:r>
+            <w:r>
+              <w:t xml:space="preserve"> </w:t>
+            </w:r>
+            <w:r>
+              <w:rPr>
+                <w:rStyle w:val="VerbatimChar"/>
+              </w:rPr>
+              <w:t xml:space="preserve">YYYY.MM.DD-HHMM-JST</w:t>
+            </w:r>
+            <w:r>
+              <w:t xml:space="preserve"> </w:t>
+            </w:r>
+            <w:r>
+              <w:t xml:space="preserve">—</w:t>
             </w:r>
             <w:r>
               <w:t xml:space="preserve"> </w:t>
@@ -1897,13 +2122,10 @@
                 <w:bCs/>
                 <w:b/>
               </w:rPr>
-              <w:t xml:space="preserve">Must change</w:t>
-            </w:r>
-            <w:r>
-              <w:t xml:space="preserve"> </w:t>
-            </w:r>
-            <w:r>
-              <w:t xml:space="preserve">whenever the bin changes.</w:t>
+              <w:t xml:space="preserve">changes every minute</w:t>
+            </w:r>
+            <w:r>
+              <w:t xml:space="preserve">, so identity == time of release.</w:t>
             </w:r>
           </w:p>
         </w:tc>
@@ -1919,7 +2141,7 @@
               <w:rPr>
                 <w:rStyle w:val="VerbatimChar"/>
               </w:rPr>
-              <w:t xml:space="preserve">binary_url</w:t>
+              <w:t xml:space="preserve">release_date</w:t>
             </w:r>
           </w:p>
         </w:tc>
@@ -1930,7 +2152,7 @@
               <w:jc w:val="left"/>
             </w:pPr>
             <w:r>
-              <w:t xml:space="preserve">Where to download. Can point to GitHub raw, NASA/GSFC mirror, etc.</w:t>
+              <w:t xml:space="preserve">Human display (date)</w:t>
             </w:r>
           </w:p>
         </w:tc>
@@ -1946,7 +2168,7 @@
               <w:rPr>
                 <w:rStyle w:val="VerbatimChar"/>
               </w:rPr>
-              <w:t xml:space="preserve">release_date</w:t>
+              <w:t xml:space="preserve">release_time_jst</w:t>
             </w:r>
           </w:p>
         </w:tc>
@@ -1957,7 +2179,7 @@
               <w:jc w:val="left"/>
             </w:pPr>
             <w:r>
-              <w:t xml:space="preserve">Human display only</w:t>
+              <w:t xml:space="preserve">Human display (time, JST)</w:t>
             </w:r>
           </w:p>
         </w:tc>
@@ -1973,7 +2195,7 @@
               <w:rPr>
                 <w:rStyle w:val="VerbatimChar"/>
               </w:rPr>
-              <w:t xml:space="preserve">notes</w:t>
+              <w:t xml:space="preserve">release_datetime_jst</w:t>
             </w:r>
           </w:p>
         </w:tc>
@@ -1984,7 +2206,7 @@
               <w:jc w:val="left"/>
             </w:pPr>
             <w:r>
-              <w:t xml:space="preserve">Shown in the in-app update dialog</w:t>
+              <w:t xml:space="preserve">Full JST stamp for sorting / change-log</w:t>
             </w:r>
           </w:p>
         </w:tc>
@@ -2000,7 +2222,7 @@
               <w:rPr>
                 <w:rStyle w:val="VerbatimChar"/>
               </w:rPr>
-              <w:t xml:space="preserve">status</w:t>
+              <w:t xml:space="preserve">release_datetime_utc</w:t>
             </w:r>
           </w:p>
         </w:tc>
@@ -2011,6 +2233,87 @@
               <w:jc w:val="left"/>
             </w:pPr>
             <w:r>
+              <w:t xml:space="preserve">UTC equivalent (for global tracking)</w:t>
+            </w:r>
+          </w:p>
+        </w:tc>
+      </w:tr>
+      <w:tr>
+        <w:tc>
+          <w:p>
+            <w:pPr>
+              <w:pStyle w:val="Compact"/>
+              <w:jc w:val="left"/>
+            </w:pPr>
+            <w:r>
+              <w:rPr>
+                <w:rStyle w:val="VerbatimChar"/>
+              </w:rPr>
+              <w:t xml:space="preserve">binary_url</w:t>
+            </w:r>
+          </w:p>
+        </w:tc>
+        <w:tc>
+          <w:p>
+            <w:pPr>
+              <w:pStyle w:val="Compact"/>
+              <w:jc w:val="left"/>
+            </w:pPr>
+            <w:r>
+              <w:t xml:space="preserve">Where the bin lives. Can point to GitHub raw, NASA/GSFC mirror, etc.</w:t>
+            </w:r>
+          </w:p>
+        </w:tc>
+      </w:tr>
+      <w:tr>
+        <w:tc>
+          <w:p>
+            <w:pPr>
+              <w:pStyle w:val="Compact"/>
+              <w:jc w:val="left"/>
+            </w:pPr>
+            <w:r>
+              <w:rPr>
+                <w:rStyle w:val="VerbatimChar"/>
+              </w:rPr>
+              <w:t xml:space="preserve">notes</w:t>
+            </w:r>
+          </w:p>
+        </w:tc>
+        <w:tc>
+          <w:p>
+            <w:pPr>
+              <w:pStyle w:val="Compact"/>
+              <w:jc w:val="left"/>
+            </w:pPr>
+            <w:r>
+              <w:t xml:space="preserve">Shown in the in-app update dialog</w:t>
+            </w:r>
+          </w:p>
+        </w:tc>
+      </w:tr>
+      <w:tr>
+        <w:tc>
+          <w:p>
+            <w:pPr>
+              <w:pStyle w:val="Compact"/>
+              <w:jc w:val="left"/>
+            </w:pPr>
+            <w:r>
+              <w:rPr>
+                <w:rStyle w:val="VerbatimChar"/>
+              </w:rPr>
+              <w:t xml:space="preserve">status</w:t>
+            </w:r>
+          </w:p>
+        </w:tc>
+        <w:tc>
+          <w:p>
+            <w:pPr>
+              <w:pStyle w:val="Compact"/>
+              <w:jc w:val="left"/>
+            </w:pPr>
+            <w:r>
               <w:t xml:space="preserve">Free-form (</w:t>
             </w:r>
             <w:r>
@@ -2050,13 +2353,13 @@
         </w:tc>
       </w:tr>
     </w:tbl>
-    <w:bookmarkStart w:id="25" w:name="version-stamp-convention"/>
+    <w:bookmarkStart w:id="25" w:name="version-stamp-convention-current"/>
     <w:p>
       <w:pPr>
         <w:pStyle w:val="Heading3"/>
       </w:pPr>
       <w:r>
-        <w:t xml:space="preserve">Version-stamp convention</w:t>
+        <w:t xml:space="preserve">Version-stamp convention (current)</w:t>
       </w:r>
     </w:p>
     <w:p>
@@ -2064,142 +2367,310 @@
         <w:pStyle w:val="FirstParagraph"/>
       </w:pPr>
       <w:r>
-        <w:rPr>
-          <w:rStyle w:val="VerbatimChar"/>
-        </w:rPr>
-        <w:t xml:space="preserve">YYYY.MM.DD&lt;suffix&gt;-&lt;channel&gt;</w:t>
-      </w:r>
-      <w:r>
-        <w:t xml:space="preserve">, e.g.:</w:t>
-      </w:r>
-      <w:r>
-        <w:t xml:space="preserve"> </w:t>
-      </w:r>
-      <w:r>
-        <w:t xml:space="preserve">-</w:t>
-      </w:r>
-      <w:r>
-        <w:t xml:space="preserve"> </w:t>
-      </w:r>
-      <w:r>
-        <w:rPr>
-          <w:rStyle w:val="VerbatimChar"/>
-        </w:rPr>
-        <w:t xml:space="preserve">2026.05.19-preview</w:t>
-      </w:r>
-      <w:r>
-        <w:t xml:space="preserve"> </w:t>
-      </w:r>
-      <w:r>
-        <w:t xml:space="preserve">(first preview)</w:t>
-      </w:r>
-      <w:r>
-        <w:t xml:space="preserve"> </w:t>
-      </w:r>
-      <w:r>
-        <w:t xml:space="preserve">-</w:t>
-      </w:r>
-      <w:r>
-        <w:t xml:space="preserve"> </w:t>
-      </w:r>
-      <w:r>
-        <w:rPr>
-          <w:rStyle w:val="VerbatimChar"/>
-        </w:rPr>
-        <w:t xml:space="preserve">2026.05.19N-preview</w:t>
-      </w:r>
-      <w:r>
-        <w:t xml:space="preserve"> </w:t>
-      </w:r>
-      <w:r>
-        <w:t xml:space="preserve">(N-th preview on same day; we used</w:t>
-      </w:r>
-      <w:r>
-        <w:t xml:space="preserve"> </w:t>
-      </w:r>
-      <w:r>
-        <w:rPr>
-          <w:rStyle w:val="VerbatimChar"/>
-        </w:rPr>
-        <w:t xml:space="preserve">N</w:t>
-      </w:r>
-      <w:r>
-        <w:t xml:space="preserve"> </w:t>
-      </w:r>
-      <w:r>
-        <w:t xml:space="preserve">for the user’s</w:t>
-      </w:r>
-      <w:r>
-        <w:t xml:space="preserve"> </w:t>
-      </w:r>
-      <w:r>
-        <w:t xml:space="preserve">morning re-add)</w:t>
-      </w:r>
-      <w:r>
-        <w:t xml:space="preserve"> </w:t>
-      </w:r>
-      <w:r>
-        <w:t xml:space="preserve">-</w:t>
-      </w:r>
-      <w:r>
-        <w:t xml:space="preserve"> </w:t>
-      </w:r>
-      <w:r>
-        <w:rPr>
-          <w:rStyle w:val="VerbatimChar"/>
-        </w:rPr>
-        <w:t xml:space="preserve">2026.05.19-gsfc</w:t>
-      </w:r>
-      <w:r>
-        <w:t xml:space="preserve"> </w:t>
-      </w:r>
-      <w:r>
-        <w:t xml:space="preserve">(live channel after NASA/GSFC approval)</w:t>
-      </w:r>
-      <w:r>
-        <w:t xml:space="preserve"> </w:t>
-      </w:r>
-      <w:r>
-        <w:t xml:space="preserve">-</w:t>
-      </w:r>
-      <w:r>
-        <w:t xml:space="preserve"> </w:t>
-      </w:r>
-      <w:r>
-        <w:rPr>
-          <w:rStyle w:val="VerbatimChar"/>
-        </w:rPr>
-        <w:t xml:space="preserve">2026.05.20-stable</w:t>
-      </w:r>
-    </w:p>
-    <w:p>
-      <w:pPr>
-        <w:pStyle w:val="BodyText"/>
-      </w:pPr>
-      <w:r>
-        <w:t xml:space="preserve">Comparison is</w:t>
-      </w:r>
-      <w:r>
-        <w:t xml:space="preserve"> </w:t>
-      </w:r>
-      <w:r>
-        <w:rPr>
+        <w:t xml:space="preserve">Auto:</w:t>
+      </w:r>
+      <w:r>
+        <w:t xml:space="preserve"> </w:t>
+      </w:r>
+      <w:r>
+        <w:rPr>
+          <w:rStyle w:val="VerbatimChar"/>
           <w:bCs/>
           <w:b/>
         </w:rPr>
+        <w:t xml:space="preserve">YYYY.MM.DD-HHMM-JST</w:t>
+      </w:r>
+      <w:r>
+        <w:t xml:space="preserve"> </w:t>
+      </w:r>
+      <w:r>
+        <w:t xml:space="preserve">— derived from the maintainer machine’s local</w:t>
+      </w:r>
+      <w:r>
+        <w:t xml:space="preserve"> </w:t>
+      </w:r>
+      <w:r>
+        <w:t xml:space="preserve">clock (which is JST). Examples:</w:t>
+      </w:r>
+      <w:r>
+        <w:t xml:space="preserve"> </w:t>
+      </w:r>
+      <w:r>
+        <w:t xml:space="preserve">-</w:t>
+      </w:r>
+      <w:r>
+        <w:t xml:space="preserve"> </w:t>
+      </w:r>
+      <w:r>
+        <w:rPr>
+          <w:rStyle w:val="VerbatimChar"/>
+        </w:rPr>
+        <w:t xml:space="preserve">2026.05.19-1845-JST</w:t>
+      </w:r>
+      <w:r>
+        <w:t xml:space="preserve"> </w:t>
+      </w:r>
+      <w:r>
+        <w:t xml:space="preserve">-</w:t>
+      </w:r>
+      <w:r>
+        <w:t xml:space="preserve"> </w:t>
+      </w:r>
+      <w:r>
+        <w:rPr>
+          <w:rStyle w:val="VerbatimChar"/>
+        </w:rPr>
+        <w:t xml:space="preserve">2026.05.19-1851-JST</w:t>
+      </w:r>
+      <w:r>
+        <w:t xml:space="preserve"> </w:t>
+      </w:r>
+      <w:r>
+        <w:t xml:space="preserve">-</w:t>
+      </w:r>
+      <w:r>
+        <w:t xml:space="preserve"> </w:t>
+      </w:r>
+      <w:r>
+        <w:rPr>
+          <w:rStyle w:val="VerbatimChar"/>
+        </w:rPr>
+        <w:t xml:space="preserve">2026.05.20-0930-JST</w:t>
+      </w:r>
+    </w:p>
+    <w:p>
+      <w:pPr>
+        <w:pStyle w:val="BodyText"/>
+      </w:pPr>
+      <w:r>
+        <w:t xml:space="preserve">The maintainer never has to think about uniqueness — the minute resolution</w:t>
+      </w:r>
+      <w:r>
+        <w:t xml:space="preserve"> </w:t>
+      </w:r>
+      <w:r>
+        <w:t xml:space="preserve">guarantees no collision across same-day pushes.</w:t>
+      </w:r>
+    </w:p>
+    <w:p>
+      <w:pPr>
+        <w:pStyle w:val="BodyText"/>
+      </w:pPr>
+      <w:r>
+        <w:t xml:space="preserve">Override only when you want a human-meaningful label (e.g. shipping</w:t>
+      </w:r>
+      <w:r>
+        <w:t xml:space="preserve"> </w:t>
+      </w:r>
+      <w:r>
+        <w:t xml:space="preserve">milestone):</w:t>
+      </w:r>
+    </w:p>
+    <w:p>
+      <w:pPr>
+        <w:pStyle w:val="SourceCode"/>
+      </w:pPr>
+      <w:r>
+        <w:rPr>
+          <w:rStyle w:val="ExtensionTok"/>
+        </w:rPr>
+        <w:t xml:space="preserve">./exokyoto_publish.sh</w:t>
+      </w:r>
+      <w:r>
+        <w:rPr>
+          <w:rStyle w:val="NormalTok"/>
+        </w:rPr>
+        <w:t xml:space="preserve"> new.xlsx </w:t>
+      </w:r>
+      <w:r>
+        <w:rPr>
+          <w:rStyle w:val="StringTok"/>
+        </w:rPr>
+        <w:t xml:space="preserve">"GSFC release"</w:t>
+      </w:r>
+      <w:r>
+        <w:rPr>
+          <w:rStyle w:val="NormalTok"/>
+        </w:rPr>
+        <w:t xml:space="preserve"> </w:t>
+      </w:r>
+      <w:r>
+        <w:rPr>
+          <w:rStyle w:val="AttributeTok"/>
+        </w:rPr>
+        <w:t xml:space="preserve">--data-version</w:t>
+      </w:r>
+      <w:r>
+        <w:rPr>
+          <w:rStyle w:val="NormalTok"/>
+        </w:rPr>
+        <w:t xml:space="preserve"> </w:t>
+      </w:r>
+      <w:r>
+        <w:rPr>
+          <w:rStyle w:val="StringTok"/>
+        </w:rPr>
+        <w:t xml:space="preserve">"2026.05.20-gsfc-stable"</w:t>
+      </w:r>
+    </w:p>
+    <w:p>
+      <w:pPr>
+        <w:pStyle w:val="FirstParagraph"/>
+      </w:pPr>
+      <w:r>
+        <w:t xml:space="preserve">Comparison is</w:t>
+      </w:r>
+      <w:r>
+        <w:t xml:space="preserve"> </w:t>
+      </w:r>
+      <w:r>
+        <w:rPr>
+          <w:bCs/>
+          <w:b/>
+        </w:rPr>
         <w:t xml:space="preserve">strict string equality</w:t>
       </w:r>
       <w:r>
         <w:t xml:space="preserve"> </w:t>
       </w:r>
       <w:r>
-        <w:t xml:space="preserve">— the client doesn’t try to parse it,</w:t>
-      </w:r>
-      <w:r>
-        <w:t xml:space="preserve"> </w:t>
-      </w:r>
-      <w:r>
-        <w:t xml:space="preserve">so any change triggers an update prompt.</w:t>
+        <w:t xml:space="preserve">on the client side — any change to</w:t>
+      </w:r>
+      <w:r>
+        <w:t xml:space="preserve"> </w:t>
+      </w:r>
+      <w:r>
+        <w:rPr>
+          <w:rStyle w:val="VerbatimChar"/>
+        </w:rPr>
+        <w:t xml:space="preserve">data_version</w:t>
+      </w:r>
+      <w:r>
+        <w:t xml:space="preserve"> </w:t>
+      </w:r>
+      <w:r>
+        <w:t xml:space="preserve">triggers an update prompt. Direction (newer/older) doesn’t</w:t>
+      </w:r>
+      <w:r>
+        <w:t xml:space="preserve"> </w:t>
+      </w:r>
+      <w:r>
+        <w:t xml:space="preserve">matter; the server is the source of truth.</w:t>
+      </w:r>
+    </w:p>
+    <w:bookmarkEnd w:id="25"/>
+    <w:bookmarkStart w:id="26" w:name="client-side-state-the-sidecar-file"/>
+    <w:p>
+      <w:pPr>
+        <w:pStyle w:val="Heading3"/>
+      </w:pPr>
+      <w:r>
+        <w:t xml:space="preserve">Client-side state: the sidecar file</w:t>
+      </w:r>
+    </w:p>
+    <w:p>
+      <w:pPr>
+        <w:pStyle w:val="FirstParagraph"/>
+      </w:pPr>
+      <w:r>
+        <w:t xml:space="preserve">When the app applies a download, it writes</w:t>
+      </w:r>
+      <w:r>
+        <w:t xml:space="preserve"> </w:t>
+      </w:r>
+      <w:r>
+        <w:rPr>
+          <w:rStyle w:val="VerbatimChar"/>
+        </w:rPr>
+        <w:t xml:space="preserve">csvin/ExoKyotoDataF.bin.version</w:t>
+      </w:r>
+      <w:r>
+        <w:t xml:space="preserve"> </w:t>
+      </w:r>
+      <w:r>
+        <w:t xml:space="preserve">(a one-line text file) with the new</w:t>
+      </w:r>
+      <w:r>
+        <w:t xml:space="preserve"> </w:t>
+      </w:r>
+      <w:r>
+        <w:rPr>
+          <w:rStyle w:val="VerbatimChar"/>
+        </w:rPr>
+        <w:t xml:space="preserve">data_version</w:t>
+      </w:r>
+      <w:r>
+        <w:t xml:space="preserve"> </w:t>
+      </w:r>
+      <w:r>
+        <w:t xml:space="preserve">string. Next launch reads this sidecar first; if absent, falls</w:t>
+      </w:r>
+      <w:r>
+        <w:t xml:space="preserve"> </w:t>
+      </w:r>
+      <w:r>
+        <w:t xml:space="preserve">back to the compile-time stamp</w:t>
+      </w:r>
+      <w:r>
+        <w:t xml:space="preserve"> </w:t>
+      </w:r>
+      <w:r>
+        <w:rPr>
+          <w:rStyle w:val="VerbatimChar"/>
+        </w:rPr>
+        <w:t xml:space="preserve">EXOKYOTO_DATA_VERSION</w:t>
+      </w:r>
+      <w:r>
+        <w:t xml:space="preserve">.</w:t>
+      </w:r>
+    </w:p>
+    <w:p>
+      <w:pPr>
+        <w:pStyle w:val="BodyText"/>
+      </w:pPr>
+      <w:r>
+        <w:t xml:space="preserve">This is what stops the endless update loop after a download — the compile-time</w:t>
+      </w:r>
+      <w:r>
+        <w:t xml:space="preserve"> </w:t>
+      </w:r>
+      <w:r>
+        <w:t xml:space="preserve">stamp inside the binary is immutable, so without the sidecar every restart</w:t>
+      </w:r>
+      <w:r>
+        <w:t xml:space="preserve"> </w:t>
+      </w:r>
+      <w:r>
+        <w:t xml:space="preserve">would re-trigger</w:t>
+      </w:r>
+      <w:r>
+        <w:t xml:space="preserve"> </w:t>
+      </w:r>
+      <w:r>
+        <w:t xml:space="preserve">“</w:t>
+      </w:r>
+      <w:r>
+        <w:t xml:space="preserve">UPDATE AVAILABLE</w:t>
+      </w:r>
+      <w:r>
+        <w:t xml:space="preserve">”</w:t>
+      </w:r>
+      <w:r>
+        <w:t xml:space="preserve">.</w:t>
+      </w:r>
+    </w:p>
+    <w:p>
+      <w:pPr>
+        <w:pStyle w:val="BodyText"/>
+      </w:pPr>
+      <w:r>
+        <w:t xml:space="preserve">The sidecar can be deleted to force re-download on next launch (useful for</w:t>
+      </w:r>
+      <w:r>
+        <w:t xml:space="preserve"> </w:t>
+      </w:r>
+      <w:r>
+        <w:t xml:space="preserve">testing or recovery).</w:t>
       </w:r>
     </w:p>
     <w:p>
@@ -2209,9 +2680,9 @@
         </w:pict>
       </w:r>
     </w:p>
-    <w:bookmarkEnd w:id="25"/>
     <w:bookmarkEnd w:id="26"/>
-    <w:bookmarkStart w:id="34" w:name="step-by-step-the-pipeline-internals"/>
+    <w:bookmarkEnd w:id="27"/>
+    <w:bookmarkStart w:id="35" w:name="step-by-step-the-pipeline-internals"/>
     <w:p>
       <w:pPr>
         <w:pStyle w:val="Heading2"/>
@@ -2220,7 +2691,7 @@
         <w:t xml:space="preserve">Step-by-step (the pipeline internals)</w:t>
       </w:r>
     </w:p>
-    <w:bookmarkStart w:id="27" w:name="step-1-diff-vs-previous"/>
+    <w:bookmarkStart w:id="28" w:name="step-1-diff-vs-previous"/>
     <w:p>
       <w:pPr>
         <w:pStyle w:val="Heading3"/>
@@ -2316,8 +2787,8 @@
         <w:t xml:space="preserve">empty and steps 2-3 are no-ops.</w:t>
       </w:r>
     </w:p>
-    <w:bookmarkEnd w:id="27"/>
-    <w:bookmarkStart w:id="28" w:name="step-2-nasa-exoplanet-archive-enrichment"/>
+    <w:bookmarkEnd w:id="28"/>
+    <w:bookmarkStart w:id="29" w:name="step-2-nasa-exoplanet-archive-enrichment"/>
     <w:p>
       <w:pPr>
         <w:pStyle w:val="Heading3"/>
@@ -2544,8 +3015,8 @@
         <w:t xml:space="preserve">if you’ve already manually filled NASA cols.</w:t>
       </w:r>
     </w:p>
-    <w:bookmarkEnd w:id="28"/>
-    <w:bookmarkStart w:id="29" w:name="step-3-ads-paper-lookup"/>
+    <w:bookmarkEnd w:id="29"/>
+    <w:bookmarkStart w:id="30" w:name="step-3-ads-paper-lookup"/>
     <w:p>
       <w:pPr>
         <w:pStyle w:val="Heading3"/>
@@ -2870,8 +3341,8 @@
         <w:t xml:space="preserve">already filled.</w:t>
       </w:r>
     </w:p>
-    <w:bookmarkEnd w:id="29"/>
-    <w:bookmarkStart w:id="30" w:name="step-4-duplicate-check"/>
+    <w:bookmarkEnd w:id="30"/>
+    <w:bookmarkStart w:id="31" w:name="step-4-duplicate-check"/>
     <w:p>
       <w:pPr>
         <w:pStyle w:val="Heading3"/>
@@ -2934,8 +3405,8 @@
         <w:t xml:space="preserve">.</w:t>
       </w:r>
     </w:p>
-    <w:bookmarkEnd w:id="30"/>
-    <w:bookmarkStart w:id="31" w:name="step-5-6-xlsx-csv-bin"/>
+    <w:bookmarkEnd w:id="31"/>
+    <w:bookmarkStart w:id="32" w:name="step-5-6-xlsx-csv-bin"/>
     <w:p>
       <w:pPr>
         <w:pStyle w:val="Heading3"/>
@@ -3018,8 +3489,8 @@
         <w:t xml:space="preserve">.</w:t>
       </w:r>
     </w:p>
-    <w:bookmarkEnd w:id="31"/>
-    <w:bookmarkStart w:id="32" w:name="step-7-archive-old-bin"/>
+    <w:bookmarkEnd w:id="32"/>
+    <w:bookmarkStart w:id="33" w:name="step-7-archive-old-bin"/>
     <w:p>
       <w:pPr>
         <w:pStyle w:val="Heading3"/>
@@ -3120,8 +3591,8 @@
         <w:t xml:space="preserve">if multiple updates happen on the same day.</w:t>
       </w:r>
     </w:p>
-    <w:bookmarkEnd w:id="32"/>
-    <w:bookmarkStart w:id="33" w:name="step-8-version.json"/>
+    <w:bookmarkEnd w:id="33"/>
+    <w:bookmarkStart w:id="34" w:name="step-8-version.json"/>
     <w:p>
       <w:pPr>
         <w:pStyle w:val="Heading3"/>
@@ -3175,9 +3646,9 @@
         </w:pict>
       </w:r>
     </w:p>
-    <w:bookmarkEnd w:id="33"/>
     <w:bookmarkEnd w:id="34"/>
-    <w:bookmarkStart w:id="38" w:name="explicit-logic-server-client"/>
+    <w:bookmarkEnd w:id="35"/>
+    <w:bookmarkStart w:id="39" w:name="explicit-logic-server-client"/>
     <w:p>
       <w:pPr>
         <w:pStyle w:val="Heading2"/>
@@ -3186,7 +3657,7 @@
         <w:t xml:space="preserve">Explicit logic (server + client)</w:t>
       </w:r>
     </w:p>
-    <w:bookmarkStart w:id="35" w:name="X297a2facc4a02404d3316a04529616038aba6a5"/>
+    <w:bookmarkStart w:id="36" w:name="X297a2facc4a02404d3316a04529616038aba6a5"/>
     <w:p>
       <w:pPr>
         <w:pStyle w:val="Heading3"/>
@@ -3455,8 +3926,8 @@
         <w:t xml:space="preserve">         - ExoKyotoData/data/latest/ExoKyotoDataF.bin</w:t>
       </w:r>
     </w:p>
-    <w:bookmarkEnd w:id="35"/>
-    <w:bookmarkStart w:id="36" w:name="client-side-what-each-running-app-does"/>
+    <w:bookmarkEnd w:id="36"/>
+    <w:bookmarkStart w:id="37" w:name="client-side-what-each-running-app-does"/>
     <w:p>
       <w:pPr>
         <w:pStyle w:val="Heading3"/>
@@ -3758,14 +4229,14 @@
         <w:t xml:space="preserve">.</w:t>
       </w:r>
     </w:p>
-    <w:bookmarkEnd w:id="36"/>
-    <w:bookmarkStart w:id="37" w:name="phase-4-auto-download-planned"/>
+    <w:bookmarkEnd w:id="37"/>
+    <w:bookmarkStart w:id="38" w:name="X4595a378597c063186a578db3beedb4265cf406"/>
     <w:p>
       <w:pPr>
         <w:pStyle w:val="Heading3"/>
       </w:pPr>
       <w:r>
-        <w:t xml:space="preserve">Phase 4 (auto-download — planned)</w:t>
+        <w:t xml:space="preserve">Phase 4 (auto-download + auto-restart — IMPLEMENTED)</w:t>
       </w:r>
     </w:p>
     <w:p>
@@ -3776,115 +4247,232 @@
         <w:rPr>
           <w:rStyle w:val="VerbatimChar"/>
         </w:rPr>
-        <w:t xml:space="preserve">ELSE branch of step 6 above:</w:t>
-      </w:r>
-      <w:r>
-        <w:br/>
-      </w:r>
-      <w:r>
-        <w:rPr>
-          <w:rStyle w:val="VerbatimChar"/>
-        </w:rPr>
-        <w:t xml:space="preserve">   1. Confirm dialog: "ExoKyoto data update available.</w:t>
-      </w:r>
-      <w:r>
-        <w:br/>
-      </w:r>
-      <w:r>
-        <w:rPr>
-          <w:rStyle w:val="VerbatimChar"/>
-        </w:rPr>
-        <w:t xml:space="preserve">                       Current : &lt;bundled&gt;</w:t>
-      </w:r>
-      <w:r>
-        <w:br/>
-      </w:r>
-      <w:r>
-        <w:rPr>
-          <w:rStyle w:val="VerbatimChar"/>
-        </w:rPr>
-        <w:t xml:space="preserve">                       Latest  : &lt;remote&gt;</w:t>
-      </w:r>
-      <w:r>
-        <w:br/>
-      </w:r>
-      <w:r>
-        <w:rPr>
-          <w:rStyle w:val="VerbatimChar"/>
-        </w:rPr>
-        <w:t xml:space="preserve">                       &lt;notes&gt;</w:t>
-      </w:r>
-      <w:r>
-        <w:br/>
-      </w:r>
-      <w:r>
-        <w:rPr>
-          <w:rStyle w:val="VerbatimChar"/>
-        </w:rPr>
-        <w:t xml:space="preserve">                       Download now?" [Yes / Later]</w:t>
-      </w:r>
-      <w:r>
-        <w:br/>
-      </w:r>
-      <w:r>
-        <w:rPr>
-          <w:rStyle w:val="VerbatimChar"/>
-        </w:rPr>
-        <w:t xml:space="preserve">   2. IF Yes:</w:t>
-      </w:r>
-      <w:r>
-        <w:br/>
-      </w:r>
-      <w:r>
-        <w:rPr>
-          <w:rStyle w:val="VerbatimChar"/>
-        </w:rPr>
-        <w:t xml:space="preserve">      curl -L --max-time 60 --fail '&lt;binary_url&gt;' -o /tmp/exokyoto_pending.bin</w:t>
-      </w:r>
-      <w:r>
-        <w:br/>
-      </w:r>
-      <w:r>
-        <w:rPr>
-          <w:rStyle w:val="VerbatimChar"/>
-        </w:rPr>
-        <w:t xml:space="preserve">      verify magic bytes "EKDBIN1\0" + reasonable size (1-50 MB)</w:t>
-      </w:r>
-      <w:r>
-        <w:br/>
-      </w:r>
-      <w:r>
-        <w:rPr>
-          <w:rStyle w:val="VerbatimChar"/>
-        </w:rPr>
-        <w:t xml:space="preserve">      mv ./csvin/ExoKyotoDataF.bin ./csvin/ExoKyotoDataF.bak.bin</w:t>
-      </w:r>
-      <w:r>
-        <w:br/>
-      </w:r>
-      <w:r>
-        <w:rPr>
-          <w:rStyle w:val="VerbatimChar"/>
-        </w:rPr>
-        <w:t xml:space="preserve">      mv /tmp/exokyoto_pending.bin ./csvin/ExoKyotoDataF.bin</w:t>
-      </w:r>
-      <w:r>
-        <w:br/>
-      </w:r>
-      <w:r>
-        <w:rPr>
-          <w:rStyle w:val="VerbatimChar"/>
-        </w:rPr>
-        <w:t xml:space="preserve">      Dialog: "Update applied. Restart the app to load the new data."</w:t>
-      </w:r>
-      <w:r>
-        <w:br/>
-      </w:r>
-      <w:r>
-        <w:rPr>
-          <w:rStyle w:val="VerbatimChar"/>
-        </w:rPr>
-        <w:t xml:space="preserve">      (we don't restart automatically because the user may have unsaved state)</w:t>
+        <w:t xml:space="preserve">On mismatch detected:</w:t>
+      </w:r>
+      <w:r>
+        <w:br/>
+      </w:r>
+      <w:r>
+        <w:br/>
+      </w:r>
+      <w:r>
+        <w:rPr>
+          <w:rStyle w:val="VerbatimChar"/>
+        </w:rPr>
+        <w:t xml:space="preserve">1. Dialog #1 — confirm download:</w:t>
+      </w:r>
+      <w:r>
+        <w:br/>
+      </w:r>
+      <w:r>
+        <w:rPr>
+          <w:rStyle w:val="VerbatimChar"/>
+        </w:rPr>
+        <w:t xml:space="preserve">       "ExoKyoto data update available.</w:t>
+      </w:r>
+      <w:r>
+        <w:br/>
+      </w:r>
+      <w:r>
+        <w:rPr>
+          <w:rStyle w:val="VerbatimChar"/>
+        </w:rPr>
+        <w:t xml:space="preserve">        Current : &lt;sidecar version, or bundled if no sidecar&gt;</w:t>
+      </w:r>
+      <w:r>
+        <w:br/>
+      </w:r>
+      <w:r>
+        <w:rPr>
+          <w:rStyle w:val="VerbatimChar"/>
+        </w:rPr>
+        <w:t xml:space="preserve">        Latest  : &lt;remote&gt;</w:t>
+      </w:r>
+      <w:r>
+        <w:br/>
+      </w:r>
+      <w:r>
+        <w:rPr>
+          <w:rStyle w:val="VerbatimChar"/>
+        </w:rPr>
+        <w:t xml:space="preserve">        &lt;notes from version.json&gt;</w:t>
+      </w:r>
+      <w:r>
+        <w:br/>
+      </w:r>
+      <w:r>
+        <w:rPr>
+          <w:rStyle w:val="VerbatimChar"/>
+        </w:rPr>
+        <w:t xml:space="preserve">        Download and apply now?"   [Later] [Download]   ← default Download</w:t>
+      </w:r>
+      <w:r>
+        <w:br/>
+      </w:r>
+      <w:r>
+        <w:br/>
+      </w:r>
+      <w:r>
+        <w:rPr>
+          <w:rStyle w:val="VerbatimChar"/>
+        </w:rPr>
+        <w:t xml:space="preserve">2. If Download:</w:t>
+      </w:r>
+      <w:r>
+        <w:br/>
+      </w:r>
+      <w:r>
+        <w:rPr>
+          <w:rStyle w:val="VerbatimChar"/>
+        </w:rPr>
+        <w:t xml:space="preserve">   a. /usr/bin/curl -sL --max-time 60 --fail '&lt;binary_url&gt;' -o /tmp/exokyoto_pending.bin</w:t>
+      </w:r>
+      <w:r>
+        <w:br/>
+      </w:r>
+      <w:r>
+        <w:rPr>
+          <w:rStyle w:val="VerbatimChar"/>
+        </w:rPr>
+        <w:t xml:space="preserve">   b. Verify magic bytes "EKDBIN1\0" + sane size (1 MB – 200 MB)</w:t>
+      </w:r>
+      <w:r>
+        <w:br/>
+      </w:r>
+      <w:r>
+        <w:rPr>
+          <w:rStyle w:val="VerbatimChar"/>
+        </w:rPr>
+        <w:t xml:space="preserve">   c. rename csvin/ExoKyotoDataF.bin → csvin/ExoKyotoDataF.bak.bin (rollback safety)</w:t>
+      </w:r>
+      <w:r>
+        <w:br/>
+      </w:r>
+      <w:r>
+        <w:rPr>
+          <w:rStyle w:val="VerbatimChar"/>
+        </w:rPr>
+        <w:t xml:space="preserve">   d. cp /tmp/exokyoto_pending.bin → csvin/ExoKyotoDataF.bin</w:t>
+      </w:r>
+      <w:r>
+        <w:br/>
+      </w:r>
+      <w:r>
+        <w:rPr>
+          <w:rStyle w:val="VerbatimChar"/>
+        </w:rPr>
+        <w:t xml:space="preserve">   e. Write csvin/ExoKyotoDataF.bin.version = &lt;remote data_version&gt;   ← sidecar</w:t>
+      </w:r>
+      <w:r>
+        <w:br/>
+      </w:r>
+      <w:r>
+        <w:rPr>
+          <w:rStyle w:val="VerbatimChar"/>
+        </w:rPr>
+        <w:t xml:space="preserve">   f. Dialog #2 — confirm restart:</w:t>
+      </w:r>
+      <w:r>
+        <w:br/>
+      </w:r>
+      <w:r>
+        <w:rPr>
+          <w:rStyle w:val="VerbatimChar"/>
+        </w:rPr>
+        <w:t xml:space="preserve">        "Update applied: &lt;remote&gt;</w:t>
+      </w:r>
+      <w:r>
+        <w:br/>
+      </w:r>
+      <w:r>
+        <w:rPr>
+          <w:rStyle w:val="VerbatimChar"/>
+        </w:rPr>
+        <w:t xml:space="preserve">         Old data backed up as csvin/ExoKyotoDataF.bak.bin</w:t>
+      </w:r>
+      <w:r>
+        <w:br/>
+      </w:r>
+      <w:r>
+        <w:rPr>
+          <w:rStyle w:val="VerbatimChar"/>
+        </w:rPr>
+        <w:t xml:space="preserve">         Restart ExoKyoto now to load the new data?"   [Later] [Restart now]   ← default Restart now</w:t>
+      </w:r>
+      <w:r>
+        <w:br/>
+      </w:r>
+      <w:r>
+        <w:rPr>
+          <w:rStyle w:val="VerbatimChar"/>
+        </w:rPr>
+        <w:t xml:space="preserve">   g. If Restart now:</w:t>
+      </w:r>
+      <w:r>
+        <w:br/>
+      </w:r>
+      <w:r>
+        <w:rPr>
+          <w:rStyle w:val="VerbatimChar"/>
+        </w:rPr>
+        <w:t xml:space="preserve">        /usr/bin/open -n '&lt;.app bundle absolute path&gt;' &amp;     # launch fresh instance</w:t>
+      </w:r>
+      <w:r>
+        <w:br/>
+      </w:r>
+      <w:r>
+        <w:rPr>
+          <w:rStyle w:val="VerbatimChar"/>
+        </w:rPr>
+        <w:t xml:space="preserve">        sleep 1</w:t>
+      </w:r>
+      <w:r>
+        <w:br/>
+      </w:r>
+      <w:r>
+        <w:rPr>
+          <w:rStyle w:val="VerbatimChar"/>
+        </w:rPr>
+        <w:t xml:space="preserve">        _exit(0)                                              # hard-exit this process</w:t>
+      </w:r>
+      <w:r>
+        <w:br/>
+      </w:r>
+      <w:r>
+        <w:br/>
+      </w:r>
+      <w:r>
+        <w:rPr>
+          <w:rStyle w:val="VerbatimChar"/>
+        </w:rPr>
+        <w:t xml:space="preserve">3. If any step fails (download error / bad magic / install rc != 0):</w:t>
+      </w:r>
+      <w:r>
+        <w:br/>
+      </w:r>
+      <w:r>
+        <w:rPr>
+          <w:rStyle w:val="VerbatimChar"/>
+        </w:rPr>
+        <w:t xml:space="preserve">   - Roll back: rename .bak.bin → live bin</w:t>
+      </w:r>
+      <w:r>
+        <w:br/>
+      </w:r>
+      <w:r>
+        <w:rPr>
+          <w:rStyle w:val="VerbatimChar"/>
+        </w:rPr>
+        <w:t xml:space="preserve">   - Dialog: "Update failed. Previous data restored."</w:t>
+      </w:r>
+      <w:r>
+        <w:br/>
+      </w:r>
+      <w:r>
+        <w:rPr>
+          <w:rStyle w:val="VerbatimChar"/>
+        </w:rPr>
+        <w:t xml:space="preserve">   - No sidecar write, so next launch will retry.</w:t>
       </w:r>
     </w:p>
     <w:p>
@@ -3892,6 +4480,141 @@
         <w:pStyle w:val="FirstParagraph"/>
       </w:pPr>
       <w:r>
+        <w:t xml:space="preserve">The</w:t>
+      </w:r>
+      <w:r>
+        <w:t xml:space="preserve"> </w:t>
+      </w:r>
+      <w:r>
+        <w:rPr>
+          <w:rStyle w:val="VerbatimChar"/>
+        </w:rPr>
+        <w:t xml:space="preserve">.app</w:t>
+      </w:r>
+      <w:r>
+        <w:t xml:space="preserve"> </w:t>
+      </w:r>
+      <w:r>
+        <w:t xml:space="preserve">bundle path is found via</w:t>
+      </w:r>
+      <w:r>
+        <w:t xml:space="preserve"> </w:t>
+      </w:r>
+      <w:r>
+        <w:rPr>
+          <w:rStyle w:val="VerbatimChar"/>
+        </w:rPr>
+        <w:t xml:space="preserve">_NSGetExecutablePath</w:t>
+      </w:r>
+      <w:r>
+        <w:t xml:space="preserve"> </w:t>
+      </w:r>
+      <w:r>
+        <w:t xml:space="preserve">+ climb-3-levels:</w:t>
+      </w:r>
+    </w:p>
+    <w:p>
+      <w:pPr>
+        <w:pStyle w:val="SourceCode"/>
+      </w:pPr>
+      <w:r>
+        <w:rPr>
+          <w:rStyle w:val="VerbatimChar"/>
+        </w:rPr>
+        <w:t xml:space="preserve">/Users/x/Apps/ExoKyoto3D.app/Contents/MacOS/SolarClass</w:t>
+      </w:r>
+      <w:r>
+        <w:br/>
+      </w:r>
+      <w:r>
+        <w:rPr>
+          <w:rStyle w:val="VerbatimChar"/>
+        </w:rPr>
+        <w:t xml:space="preserve">                              ↓ climb 3 levels</w:t>
+      </w:r>
+      <w:r>
+        <w:br/>
+      </w:r>
+      <w:r>
+        <w:rPr>
+          <w:rStyle w:val="VerbatimChar"/>
+        </w:rPr>
+        <w:t xml:space="preserve">/Users/x/Apps/ExoKyoto3D.app</w:t>
+      </w:r>
+    </w:p>
+    <w:p>
+      <w:pPr>
+        <w:pStyle w:val="FirstParagraph"/>
+      </w:pPr>
+      <w:r>
+        <w:t xml:space="preserve">If</w:t>
+      </w:r>
+      <w:r>
+        <w:t xml:space="preserve"> </w:t>
+      </w:r>
+      <w:r>
+        <w:rPr>
+          <w:rStyle w:val="VerbatimChar"/>
+        </w:rPr>
+        <w:t xml:space="preserve">_NSGetExecutablePath</w:t>
+      </w:r>
+      <w:r>
+        <w:t xml:space="preserve"> </w:t>
+      </w:r>
+      <w:r>
+        <w:t xml:space="preserve">doesn’t end in a</w:t>
+      </w:r>
+      <w:r>
+        <w:t xml:space="preserve"> </w:t>
+      </w:r>
+      <w:r>
+        <w:rPr>
+          <w:rStyle w:val="VerbatimChar"/>
+        </w:rPr>
+        <w:t xml:space="preserve">.app/Contents/MacOS/...</w:t>
+      </w:r>
+      <w:r>
+        <w:t xml:space="preserve"> </w:t>
+      </w:r>
+      <w:r>
+        <w:t xml:space="preserve">path (dev</w:t>
+      </w:r>
+      <w:r>
+        <w:t xml:space="preserve"> </w:t>
+      </w:r>
+      <w:r>
+        <w:t xml:space="preserve">mode), the auto-restart is disabled and the dialog reverts to a plain</w:t>
+      </w:r>
+      <w:r>
+        <w:t xml:space="preserve"> </w:t>
+      </w:r>
+      <w:r>
+        <w:t xml:space="preserve">“</w:t>
+      </w:r>
+      <w:r>
+        <w:t xml:space="preserve">please</w:t>
+      </w:r>
+      <w:r>
+        <w:t xml:space="preserve"> </w:t>
+      </w:r>
+      <w:r>
+        <w:t xml:space="preserve">restart</w:t>
+      </w:r>
+      <w:r>
+        <w:t xml:space="preserve">”</w:t>
+      </w:r>
+      <w:r>
+        <w:t xml:space="preserve"> </w:t>
+      </w:r>
+      <w:r>
+        <w:t xml:space="preserve">OK button.</w:t>
+      </w:r>
+    </w:p>
+    <w:p>
+      <w:pPr>
+        <w:pStyle w:val="BodyText"/>
+      </w:pPr>
+      <w:r>
         <w:t xml:space="preserve">Path note: when launched via the</w:t>
       </w:r>
       <w:r>
@@ -3952,13 +4675,19 @@
         <w:t xml:space="preserve"> </w:t>
       </w:r>
       <w:r>
-        <w:t xml:space="preserve">the correct in-bundle location for the bin. Code-signed apps may refuse this</w:t>
-      </w:r>
-      <w:r>
-        <w:t xml:space="preserve"> </w:t>
-      </w:r>
-      <w:r>
-        <w:t xml:space="preserve">in the future — current unsigned distribution allows it.</w:t>
+        <w:t xml:space="preserve">the correct in-bundle location for both the bin and its sidecar. Code-signed</w:t>
+      </w:r>
+      <w:r>
+        <w:t xml:space="preserve"> </w:t>
+      </w:r>
+      <w:r>
+        <w:t xml:space="preserve">apps may refuse the in-place overwrite in the future — current unsigned</w:t>
+      </w:r>
+      <w:r>
+        <w:t xml:space="preserve"> </w:t>
+      </w:r>
+      <w:r>
+        <w:t xml:space="preserve">distribution allows it.</w:t>
       </w:r>
     </w:p>
     <w:p>
@@ -3968,9 +4697,9 @@
         </w:pict>
       </w:r>
     </w:p>
-    <w:bookmarkEnd w:id="37"/>
     <w:bookmarkEnd w:id="38"/>
-    <w:bookmarkStart w:id="39" w:name="client-side-in-app-update-flow"/>
+    <w:bookmarkEnd w:id="39"/>
+    <w:bookmarkStart w:id="40" w:name="client-side-in-app-update-flow"/>
     <w:p>
       <w:pPr>
         <w:pStyle w:val="Heading2"/>
@@ -4413,8 +5142,8 @@
         </w:pict>
       </w:r>
     </w:p>
-    <w:bookmarkEnd w:id="39"/>
-    <w:bookmarkStart w:id="43" w:name="manual-override-rollback"/>
+    <w:bookmarkEnd w:id="40"/>
+    <w:bookmarkStart w:id="44" w:name="manual-override-rollback"/>
     <w:p>
       <w:pPr>
         <w:pStyle w:val="Heading2"/>
@@ -4423,7 +5152,7 @@
         <w:t xml:space="preserve">Manual override / rollback</w:t>
       </w:r>
     </w:p>
-    <w:bookmarkStart w:id="40" w:name="roll-back-to-a-previous-bin"/>
+    <w:bookmarkStart w:id="41" w:name="roll-back-to-a-previous-bin"/>
     <w:p>
       <w:pPr>
         <w:pStyle w:val="Heading3"/>
@@ -4488,8 +5217,8 @@
         <w:t xml:space="preserve"># then push that bin to GitHub (and don't change version.json, or revert it)</w:t>
       </w:r>
     </w:p>
-    <w:bookmarkEnd w:id="40"/>
-    <w:bookmarkStart w:id="41" w:name="X25d6b01083afbc3331f6a562baac11a586a701a"/>
+    <w:bookmarkEnd w:id="41"/>
+    <w:bookmarkStart w:id="42" w:name="X25d6b01083afbc3331f6a562baac11a586a701a"/>
     <w:p>
       <w:pPr>
         <w:pStyle w:val="Heading3"/>
@@ -4569,8 +5298,8 @@
         <w:t xml:space="preserve"> ~/Library/Logs/ExoKyoto/update_check.log</w:t>
       </w:r>
     </w:p>
-    <w:bookmarkEnd w:id="41"/>
-    <w:bookmarkStart w:id="42" w:name="test-pipeline-without-writing-anything"/>
+    <w:bookmarkEnd w:id="42"/>
+    <w:bookmarkStart w:id="43" w:name="test-pipeline-without-writing-anything"/>
     <w:p>
       <w:pPr>
         <w:pStyle w:val="Heading3"/>
@@ -4645,9 +5374,9 @@
         </w:pict>
       </w:r>
     </w:p>
-    <w:bookmarkEnd w:id="42"/>
     <w:bookmarkEnd w:id="43"/>
-    <w:bookmarkStart w:id="44" w:name="dependencies"/>
+    <w:bookmarkEnd w:id="44"/>
+    <w:bookmarkStart w:id="45" w:name="dependencies"/>
     <w:p>
       <w:pPr>
         <w:pStyle w:val="Heading2"/>
@@ -4765,8 +5494,8 @@
         </w:pict>
       </w:r>
     </w:p>
-    <w:bookmarkEnd w:id="44"/>
-    <w:bookmarkStart w:id="45" w:name="related-files"/>
+    <w:bookmarkEnd w:id="45"/>
+    <w:bookmarkStart w:id="46" w:name="related-files"/>
     <w:p>
       <w:pPr>
         <w:pStyle w:val="Heading2"/>
@@ -5095,8 +5824,8 @@
         </w:tc>
       </w:tr>
     </w:tbl>
-    <w:bookmarkEnd w:id="45"/>
     <w:bookmarkEnd w:id="46"/>
+    <w:bookmarkEnd w:id="47"/>
     <w:sectPr/>
   </w:body>
 </w:document>

</xml_diff>